<commit_message>
Guarda avances en REQUERIMIENTOS_NECESIDADES.docx
</commit_message>
<xml_diff>
--- a/tareas/REQUERIMIENTOS_NECESIDADES.docx
+++ b/tareas/REQUERIMIENTOS_NECESIDADES.docx
@@ -344,19 +344,20 @@
         <w:t>El sistema deberá centralizar la información de rutas, recorridos y experiencias para que pueda ser consultada desde una misma plataforma.</w:t>
       </w:r>
     </w:p>
-    <w:p/>
-    <w:p>
-      <w:pPr>
+    <w:p>
+      <w:r>
+        <w:t>Preguntas</w:t>
+      </w:r>
+    </w:p>
+    <w:p>
+      <w:pPr>
+        <w:pStyle w:val="Prrafodelista"/>
         <w:numPr>
           <w:ilvl w:val="0"/>
-          <w:numId w:val="1"/>
+          <w:numId w:val="2"/>
         </w:numPr>
       </w:pPr>
       <w:r>
-        <w:rPr>
-          <w:b/>
-          <w:bCs/>
-        </w:rPr>
         <w:t>¿Todas las necesidades expresadas por el cliente son requisitos?</w:t>
       </w:r>
       <w:r>
@@ -366,16 +367,13 @@
     </w:p>
     <w:p>
       <w:pPr>
+        <w:pStyle w:val="Prrafodelista"/>
         <w:numPr>
           <w:ilvl w:val="0"/>
-          <w:numId w:val="1"/>
+          <w:numId w:val="2"/>
         </w:numPr>
       </w:pPr>
       <w:r>
-        <w:rPr>
-          <w:b/>
-          <w:bCs/>
-        </w:rPr>
         <w:t>¿Puede existir información ambigua?</w:t>
       </w:r>
       <w:r>
@@ -385,16 +383,13 @@
     </w:p>
     <w:p>
       <w:pPr>
+        <w:pStyle w:val="Prrafodelista"/>
         <w:numPr>
           <w:ilvl w:val="0"/>
-          <w:numId w:val="1"/>
+          <w:numId w:val="2"/>
         </w:numPr>
       </w:pPr>
       <w:r>
-        <w:rPr>
-          <w:b/>
-          <w:bCs/>
-        </w:rPr>
         <w:t>¿Qué debemos hacer cuando no entendemos una respuesta?</w:t>
       </w:r>
       <w:r>
@@ -404,41 +399,21 @@
     </w:p>
     <w:p>
       <w:pPr>
+        <w:pStyle w:val="Prrafodelista"/>
         <w:numPr>
           <w:ilvl w:val="0"/>
-          <w:numId w:val="1"/>
+          <w:numId w:val="2"/>
         </w:numPr>
-      </w:pPr>
-      <w:r>
-        <w:rPr>
-          <w:b/>
-          <w:bCs/>
-        </w:rPr>
+        <w:tabs>
+          <w:tab w:val="num" w:pos="720"/>
+        </w:tabs>
+      </w:pPr>
+      <w:r>
         <w:t>¿Qué diferencia existe entre una necesidad y un requisito?</w:t>
       </w:r>
       <w:r>
         <w:br/>
-        <w:t xml:space="preserve">Una </w:t>
-      </w:r>
-      <w:r>
-        <w:rPr>
-          <w:b/>
-          <w:bCs/>
-        </w:rPr>
-        <w:t>necesidad</w:t>
-      </w:r>
-      <w:r>
-        <w:t xml:space="preserve"> expresa un problema o algo que el usuario necesita lograr. Un </w:t>
-      </w:r>
-      <w:r>
-        <w:rPr>
-          <w:b/>
-          <w:bCs/>
-        </w:rPr>
-        <w:t>requisito</w:t>
-      </w:r>
-      <w:r>
-        <w:t xml:space="preserve"> define de manera más clara lo que el sistema deberá hacer para responder a esa necesidad. </w:t>
+        <w:t xml:space="preserve">Una necesidad expresa un problema o algo que el usuario necesita lograr. Un requisito define de manera más clara lo que el sistema deberá hacer para responder a esa necesidad. </w:t>
       </w:r>
     </w:p>
     <w:p/>
@@ -455,6 +430,95 @@
 <file path=word/numbering.xml><?xml version="1.0" encoding="utf-8"?>
 <w:numbering xmlns:wpc="http://schemas.microsoft.com/office/word/2010/wordprocessingCanvas" xmlns:cx="http://schemas.microsoft.com/office/drawing/2014/chartex" xmlns:cx1="http://schemas.microsoft.com/office/drawing/2015/9/8/chartex" xmlns:cx2="http://schemas.microsoft.com/office/drawing/2015/10/21/chartex" xmlns:cx3="http://schemas.microsoft.com/office/drawing/2016/5/9/chartex" xmlns:cx4="http://schemas.microsoft.com/office/drawing/2016/5/10/chartex" xmlns:cx5="http://schemas.microsoft.com/office/drawing/2016/5/11/chartex" xmlns:cx6="http://schemas.microsoft.com/office/drawing/2016/5/12/chartex" xmlns:cx7="http://schemas.microsoft.com/office/drawing/2016/5/13/chartex" xmlns:cx8="http://schemas.microsoft.com/office/drawing/2016/5/14/chartex" xmlns:mc="http://schemas.openxmlformats.org/markup-compatibility/2006" xmlns:aink="http://schemas.microsoft.com/office/drawing/2016/ink" xmlns:am3d="http://schemas.microsoft.com/office/drawing/2017/model3d" xmlns:o="urn:schemas-microsoft-com:office:office" xmlns:oel="http://schemas.microsoft.com/office/2019/extlst" xmlns:r="http://schemas.openxmlformats.org/officeDocument/2006/relationships" xmlns:m="http://schemas.openxmlformats.org/officeDocument/2006/math" xmlns:v="urn:schemas-microsoft-com:vml" xmlns:wp14="http://schemas.microsoft.com/office/word/2010/wordprocessingDrawing" xmlns:wp="http://schemas.openxmlformats.org/drawingml/2006/wordprocessingDrawing" xmlns:w10="urn:schemas-microsoft-com:office:word" xmlns:w="http://schemas.openxmlformats.org/wordprocessingml/2006/main" xmlns:w14="http://schemas.microsoft.com/office/word/2010/wordml" xmlns:w15="http://schemas.microsoft.com/office/word/2012/wordml" xmlns:w16cex="http://schemas.microsoft.com/office/word/2018/wordml/cex" xmlns:w16cid="http://schemas.microsoft.com/office/word/2016/wordml/cid" xmlns:w16="http://schemas.microsoft.com/office/word/2018/wordml" xmlns:w16sdtdh="http://schemas.microsoft.com/office/word/2020/wordml/sdtdatahash" xmlns:w16se="http://schemas.microsoft.com/office/word/2015/wordml/symex" xmlns:wpg="http://schemas.microsoft.com/office/word/2010/wordprocessingGroup" xmlns:wpi="http://schemas.microsoft.com/office/word/2010/wordprocessingInk" xmlns:wne="http://schemas.microsoft.com/office/word/2006/wordml" xmlns:wps="http://schemas.microsoft.com/office/word/2010/wordprocessingShape" mc:Ignorable="w14 w15 w16se w16cid w16 w16cex w16sdtdh wp14">
   <w:abstractNum w:abstractNumId="0" w15:restartNumberingAfterBreak="0">
+    <w:nsid w:val="4F320081"/>
+    <w:multiLevelType w:val="hybridMultilevel"/>
+    <w:tmpl w:val="C84818EE"/>
+    <w:lvl w:ilvl="0" w:tplc="400A000F">
+      <w:start w:val="1"/>
+      <w:numFmt w:val="decimal"/>
+      <w:lvlText w:val="%1."/>
+      <w:lvlJc w:val="left"/>
+      <w:pPr>
+        <w:ind w:left="720" w:hanging="360"/>
+      </w:pPr>
+      <w:rPr>
+        <w:rFonts w:hint="default"/>
+      </w:rPr>
+    </w:lvl>
+    <w:lvl w:ilvl="1" w:tplc="400A0019" w:tentative="1">
+      <w:start w:val="1"/>
+      <w:numFmt w:val="lowerLetter"/>
+      <w:lvlText w:val="%2."/>
+      <w:lvlJc w:val="left"/>
+      <w:pPr>
+        <w:ind w:left="1440" w:hanging="360"/>
+      </w:pPr>
+    </w:lvl>
+    <w:lvl w:ilvl="2" w:tplc="400A001B" w:tentative="1">
+      <w:start w:val="1"/>
+      <w:numFmt w:val="lowerRoman"/>
+      <w:lvlText w:val="%3."/>
+      <w:lvlJc w:val="right"/>
+      <w:pPr>
+        <w:ind w:left="2160" w:hanging="180"/>
+      </w:pPr>
+    </w:lvl>
+    <w:lvl w:ilvl="3" w:tplc="400A000F" w:tentative="1">
+      <w:start w:val="1"/>
+      <w:numFmt w:val="decimal"/>
+      <w:lvlText w:val="%4."/>
+      <w:lvlJc w:val="left"/>
+      <w:pPr>
+        <w:ind w:left="2880" w:hanging="360"/>
+      </w:pPr>
+    </w:lvl>
+    <w:lvl w:ilvl="4" w:tplc="400A0019" w:tentative="1">
+      <w:start w:val="1"/>
+      <w:numFmt w:val="lowerLetter"/>
+      <w:lvlText w:val="%5."/>
+      <w:lvlJc w:val="left"/>
+      <w:pPr>
+        <w:ind w:left="3600" w:hanging="360"/>
+      </w:pPr>
+    </w:lvl>
+    <w:lvl w:ilvl="5" w:tplc="400A001B" w:tentative="1">
+      <w:start w:val="1"/>
+      <w:numFmt w:val="lowerRoman"/>
+      <w:lvlText w:val="%6."/>
+      <w:lvlJc w:val="right"/>
+      <w:pPr>
+        <w:ind w:left="4320" w:hanging="180"/>
+      </w:pPr>
+    </w:lvl>
+    <w:lvl w:ilvl="6" w:tplc="400A000F" w:tentative="1">
+      <w:start w:val="1"/>
+      <w:numFmt w:val="decimal"/>
+      <w:lvlText w:val="%7."/>
+      <w:lvlJc w:val="left"/>
+      <w:pPr>
+        <w:ind w:left="5040" w:hanging="360"/>
+      </w:pPr>
+    </w:lvl>
+    <w:lvl w:ilvl="7" w:tplc="400A0019" w:tentative="1">
+      <w:start w:val="1"/>
+      <w:numFmt w:val="lowerLetter"/>
+      <w:lvlText w:val="%8."/>
+      <w:lvlJc w:val="left"/>
+      <w:pPr>
+        <w:ind w:left="5760" w:hanging="360"/>
+      </w:pPr>
+    </w:lvl>
+    <w:lvl w:ilvl="8" w:tplc="400A001B" w:tentative="1">
+      <w:start w:val="1"/>
+      <w:numFmt w:val="lowerRoman"/>
+      <w:lvlText w:val="%9."/>
+      <w:lvlJc w:val="right"/>
+      <w:pPr>
+        <w:ind w:left="6480" w:hanging="180"/>
+      </w:pPr>
+    </w:lvl>
+  </w:abstractNum>
+  <w:abstractNum w:abstractNumId="1" w15:restartNumberingAfterBreak="0">
     <w:nsid w:val="5ADB5A84"/>
     <w:multiLevelType w:val="multilevel"/>
     <w:tmpl w:val="6F30E610"/>
@@ -568,6 +632,9 @@
     </w:lvl>
   </w:abstractNum>
   <w:num w:numId="1" w16cid:durableId="1281642277">
+    <w:abstractNumId w:val="1"/>
+  </w:num>
+  <w:num w:numId="2" w16cid:durableId="1167595743">
     <w:abstractNumId w:val="0"/>
   </w:num>
 </w:numbering>

</xml_diff>